<commit_message>
phase2.2: charged-sphere development approach v2 - Stage 0 done (OPLS-AA values from the Supporting Information, Behrens sigma/sp3 discrepancy, Murphy 2000 read in the original), Stage 2 sphere sizes fixed [retained-final]
</commit_message>
<xml_diff>
--- a/phase2.2/CHARGED_SPHERE_DEVELOPMENT_APPROACH.docx
+++ b/phase2.2/CHARGED_SPHERE_DEVELOPMENT_APPROACH.docx
@@ -23,7 +23,7 @@
         <w:spacing w:after="240"/>
       </w:pPr>
       <w:r>
-        <w:t xml:space="preserve">PhD 2026 · charge-based design for the chorismate-to-prephenate rearrangement · 7 October 2026</w:t>
+        <w:t xml:space="preserve">PhD 2026 · charge-based design for the chorismate-to-prephenate rearrangement · 7 October 2026, updated after Stage 0</w:t>
       </w:r>
     </w:p>
     <w:p>
@@ -106,7 +106,7 @@
         <w:t xml:space="preserve">min</w:t>
       </w:r>
       <w:r>
-        <w:t xml:space="preserve">, geometric mean of ε). Behrens used an sp3 carbon (σ 3.55 Å); its ε is to be read from the OPLS-AA paper once it is in the library;</w:t>
+        <w:t xml:space="preserve">, geometric mean of ε). Behrens describes his quasi-atoms as mimicking an sp3 carbon with σ = 3.55 Å; in OPLS-AA (Supporting Information, Table 1) sp3 carbon is σ 3.500 Å, ε 0.066 kcal/mol, and 3.55 Å is the sp2 carbon, so Stage 2 tests both values;</w:t>
       </w:r>
     </w:p>
     <w:p>
@@ -368,33 +368,185 @@
         <w:pStyle w:val="Heading2"/>
       </w:pPr>
       <w:r>
-        <w:t xml:space="preserve">Stage 0: records and references (no compute)</w:t>
-      </w:r>
-    </w:p>
-    <w:p>
-      <w:pPr>
-        <w:pStyle w:val="ListParagraph"/>
-        <w:numPr>
-          <w:ilvl w:val="0"/>
-          <w:numId w:val="2"/>
-        </w:numPr>
-        <w:spacing w:after="60"/>
-      </w:pPr>
-      <w:r>
-        <w:t xml:space="preserve">Update decision D2 (a site is a charged sphere with adjustable q), D4 (validation group deferred) and D-WP4 (arm c's failure attributed to its parmchk2 torsions).</w:t>
-      </w:r>
-    </w:p>
-    <w:p>
-      <w:pPr>
-        <w:pStyle w:val="ListParagraph"/>
-        <w:numPr>
-          <w:ilvl w:val="0"/>
-          <w:numId w:val="2"/>
-        </w:numPr>
-        <w:spacing w:after="60"/>
-      </w:pPr>
-      <w:r>
-        <w:t xml:space="preserve">Download the four papers listed under References to obtain. Murphy 2000 (enlarged QM-atom radii) and OPLS-AA (sp3-carbon ε) are read before Stage 2 uses them.</w:t>
+        <w:t xml:space="preserve">Stage 0: records and references (done 7 October 2026)</w:t>
+      </w:r>
+    </w:p>
+    <w:p>
+      <w:pPr>
+        <w:pStyle w:val="ListParagraph"/>
+        <w:numPr>
+          <w:ilvl w:val="0"/>
+          <w:numId w:val="2"/>
+        </w:numPr>
+        <w:spacing w:after="60"/>
+      </w:pPr>
+      <w:r>
+        <w:rPr>
+          <w:b/>
+          <w:bCs/>
+        </w:rPr>
+        <w:t xml:space="preserve">References added</w:t>
+      </w:r>
+      <w:r>
+        <w:t xml:space="preserve"> to the literature repo (chorismate-refs 5181258): Laino et al. 2005, Murphy, Philipp &amp; Friesner 2000, the OPLS-AA Supporting Information (Jorgensen, Maxwell &amp; Tirado-Rives 1996) and Beker &amp; Sokalski 2020.</w:t>
+      </w:r>
+    </w:p>
+    <w:p>
+      <w:pPr>
+        <w:pStyle w:val="ListParagraph"/>
+        <w:numPr>
+          <w:ilvl w:val="0"/>
+          <w:numId w:val="2"/>
+        </w:numPr>
+        <w:spacing w:after="60"/>
+      </w:pPr>
+      <w:r>
+        <w:rPr>
+          <w:b/>
+          <w:bCs/>
+        </w:rPr>
+        <w:t xml:space="preserve">OPLS-AA, Supporting Information Table 1</w:t>
+      </w:r>
+      <w:r>
+        <w:t xml:space="preserve"> (a scan; values read by OCR and checked against the page image):</w:t>
+      </w:r>
+    </w:p>
+    <w:p>
+      <w:pPr>
+        <w:pStyle w:val="ListParagraph"/>
+        <w:numPr>
+          <w:ilvl w:val="1"/>
+          <w:numId w:val="2"/>
+        </w:numPr>
+        <w:spacing w:after="60"/>
+      </w:pPr>
+      <w:r>
+        <w:t xml:space="preserve">sp3 carbon (CH4, RCH3, R2CH2, R3CH, R4C): σ 3.500 Å, ε 0.066 kcal/mol (R* 1.964 Å);</w:t>
+      </w:r>
+    </w:p>
+    <w:p>
+      <w:pPr>
+        <w:pStyle w:val="ListParagraph"/>
+        <w:numPr>
+          <w:ilvl w:val="1"/>
+          <w:numId w:val="2"/>
+        </w:numPr>
+        <w:spacing w:after="60"/>
+      </w:pPr>
+      <w:r>
+        <w:t xml:space="preserve">sp2 carbon (benzene): σ 3.550 Å, ε 0.070; alkene carbon: σ 3.550 Å, ε 0.076 (R* 1.992 Å);</w:t>
+      </w:r>
+    </w:p>
+    <w:p>
+      <w:pPr>
+        <w:pStyle w:val="ListParagraph"/>
+        <w:numPr>
+          <w:ilvl w:val="1"/>
+          <w:numId w:val="2"/>
+        </w:numPr>
+        <w:spacing w:after="60"/>
+      </w:pPr>
+      <w:r>
+        <w:t xml:space="preserve">hydroxyl hydrogen H(O): σ 0, ε 0. Zero-LJ polar hydrogens are standard OPLS-AA practice, as in GAFF, so the H8 risk in Stage 2 is generic to these force fields.</w:t>
+      </w:r>
+    </w:p>
+    <w:p>
+      <w:pPr>
+        <w:pStyle w:val="ListParagraph"/>
+        <w:numPr>
+          <w:ilvl w:val="0"/>
+          <w:numId w:val="2"/>
+        </w:numPr>
+        <w:spacing w:after="60"/>
+      </w:pPr>
+      <w:r>
+        <w:rPr>
+          <w:b/>
+          <w:bCs/>
+        </w:rPr>
+        <w:t xml:space="preserve">A discrepancy in Behrens' thesis:</w:t>
+      </w:r>
+      <w:r>
+        <w:t xml:space="preserve"> his quasi-atoms are described as mimicking an sp3 carbon, but σ = 3.55 Å is OPLS-AA's sp2 carbon (sp3 is 3.50 Å). Stage 2 tests both values; neither is chosen silently.</w:t>
+      </w:r>
+    </w:p>
+    <w:p>
+      <w:pPr>
+        <w:pStyle w:val="ListParagraph"/>
+        <w:numPr>
+          <w:ilvl w:val="0"/>
+          <w:numId w:val="2"/>
+        </w:numPr>
+        <w:spacing w:after="60"/>
+      </w:pPr>
+      <w:r>
+        <w:rPr>
+          <w:b/>
+          <w:bCs/>
+        </w:rPr>
+        <w:t xml:space="preserve">Murphy, Philipp &amp; Friesner 2000</w:t>
+      </w:r>
+      <w:r>
+        <w:t xml:space="preserve"> confirms the summary in Senn &amp; Thiel and gives the reason:</w:t>
+      </w:r>
+    </w:p>
+    <w:p>
+      <w:pPr>
+        <w:pStyle w:val="ListParagraph"/>
+        <w:numPr>
+          <w:ilvl w:val="1"/>
+          <w:numId w:val="2"/>
+        </w:numPr>
+        <w:spacing w:after="60"/>
+      </w:pPr>
+      <w:r>
+        <w:t xml:space="preserve">QM-atom van der Waals radii were re-fitted against about 200 hydrogen-bonded dimers (LMP2/cc-pVTZ), giving "a 5–10% increase in the QM–MM radii relative to OPLS-AA";</w:t>
+      </w:r>
+    </w:p>
+    <w:p>
+      <w:pPr>
+        <w:pStyle w:val="ListParagraph"/>
+        <w:numPr>
+          <w:ilvl w:val="1"/>
+          <w:numId w:val="2"/>
+        </w:numPr>
+        <w:spacing w:after="60"/>
+      </w:pPr>
+      <w:r>
+        <w:t xml:space="preserve">the reason: "the QM wave function sees no Pauli repulsion from MM charges", so ordinary MM radii let the QM region be overly attracted;</w:t>
+      </w:r>
+    </w:p>
+    <w:p>
+      <w:pPr>
+        <w:pStyle w:val="ListParagraph"/>
+        <w:numPr>
+          <w:ilvl w:val="1"/>
+          <w:numId w:val="2"/>
+        </w:numPr>
+        <w:spacing w:after="60"/>
+      </w:pPr>
+      <w:r>
+        <w:t xml:space="preserve">N–H···(O,S) hydrogen bonds received an extra repulsive term (ε 20 kcal/mol, σ 0.15 Å⁻²), likened to a repulsive core pseudopotential. It does not transfer directly (the spheres carry no hydrogen), but it shows a plain force-field wall may be on the weak side, which supports testing enlarged spheres (Stage 2) and the spill-out check (Stage 4).</w:t>
+      </w:r>
+    </w:p>
+    <w:p>
+      <w:pPr>
+        <w:pStyle w:val="ListParagraph"/>
+        <w:numPr>
+          <w:ilvl w:val="0"/>
+          <w:numId w:val="2"/>
+        </w:numPr>
+        <w:spacing w:after="60"/>
+      </w:pPr>
+      <w:r>
+        <w:rPr>
+          <w:b/>
+          <w:bCs/>
+        </w:rPr>
+        <w:t xml:space="preserve">Still open:</w:t>
+      </w:r>
+      <w:r>
+        <w:t xml:space="preserve"> decisions D2, D4 and D-WP4 to be updated in CHARGE_MODEL_DECISIONS.md; the OPLS-AA article itself (as distinct from its Supporting Information) to be added to the library.</w:t>
       </w:r>
     </w:p>
     <w:p>
@@ -539,27 +691,76 @@
         <w:spacing w:after="60"/>
       </w:pPr>
       <w:r>
-        <w:t xml:space="preserve">If it happens, the literature options are giving the QM hydrogen a small LJ (Senn &amp; Thiel describe re-fitted QM radii; primary source Murphy 2000, to be read) or keeping negative spheres away from H8. The enzyme's Phase 1 runs share the same zero, which would be noted.</w:t>
-      </w:r>
-    </w:p>
-    <w:p>
-      <w:pPr>
-        <w:pStyle w:val="ListParagraph"/>
-        <w:numPr>
-          <w:ilvl w:val="0"/>
-          <w:numId w:val="2"/>
-        </w:numPr>
-        <w:spacing w:after="60"/>
-      </w:pPr>
-      <w:r>
-        <w:rPr>
-          <w:b/>
-          <w:bCs/>
-        </w:rPr>
-        <w:t xml:space="preserve">Sphere size:</w:t>
-      </w:r>
-      <w:r>
-        <w:t xml:space="preserve"> Amber N against GOCAT's sp3 carbon, at each q.</w:t>
+        <w:t xml:space="preserve">If it happens, the literature options are giving the QM hydrogen a small LJ (re-fitted QM radii: Senn &amp; Thiel, and Murphy 2000, read at Stage 0) or keeping negative spheres away from H8. The enzyme's Phase 1 runs share the same zero, which would be noted.</w:t>
+      </w:r>
+    </w:p>
+    <w:p>
+      <w:pPr>
+        <w:pStyle w:val="ListParagraph"/>
+        <w:numPr>
+          <w:ilvl w:val="0"/>
+          <w:numId w:val="2"/>
+        </w:numPr>
+        <w:spacing w:after="60"/>
+      </w:pPr>
+      <w:r>
+        <w:rPr>
+          <w:b/>
+          <w:bCs/>
+        </w:rPr>
+        <w:t xml:space="preserve">Sphere sizes, at each q:</w:t>
+      </w:r>
+    </w:p>
+    <w:p>
+      <w:pPr>
+        <w:pStyle w:val="ListParagraph"/>
+        <w:numPr>
+          <w:ilvl w:val="1"/>
+          <w:numId w:val="2"/>
+        </w:numPr>
+        <w:spacing w:after="60"/>
+      </w:pPr>
+      <w:r>
+        <w:t xml:space="preserve">Amber N, R* 1.824 Å, ε 0.170 kcal/mol (baseline);</w:t>
+      </w:r>
+    </w:p>
+    <w:p>
+      <w:pPr>
+        <w:pStyle w:val="ListParagraph"/>
+        <w:numPr>
+          <w:ilvl w:val="1"/>
+          <w:numId w:val="2"/>
+        </w:numPr>
+        <w:spacing w:after="60"/>
+      </w:pPr>
+      <w:r>
+        <w:t xml:space="preserve">Amber N enlarged by 5% and 10% (R* 1.915 and 2.006 Å), the range of Murphy et al. 2000;</w:t>
+      </w:r>
+    </w:p>
+    <w:p>
+      <w:pPr>
+        <w:pStyle w:val="ListParagraph"/>
+        <w:numPr>
+          <w:ilvl w:val="1"/>
+          <w:numId w:val="2"/>
+        </w:numPr>
+        <w:spacing w:after="60"/>
+      </w:pPr>
+      <w:r>
+        <w:t xml:space="preserve">OPLS-AA sp3 carbon, σ 3.500 Å, ε 0.066 (R* 1.964 Å);</w:t>
+      </w:r>
+    </w:p>
+    <w:p>
+      <w:pPr>
+        <w:pStyle w:val="ListParagraph"/>
+        <w:numPr>
+          <w:ilvl w:val="1"/>
+          <w:numId w:val="2"/>
+        </w:numPr>
+        <w:spacing w:after="60"/>
+      </w:pPr>
+      <w:r>
+        <w:t xml:space="preserve">Behrens' stated σ 3.55 Å with ε 0.066 (R* 1.992 Å).</w:t>
       </w:r>
     </w:p>
     <w:p>
@@ -1812,7 +2013,7 @@
         <w:spacing w:after="60"/>
       </w:pPr>
       <w:r>
-        <w:t xml:space="preserve">Jorgensen, Maxwell &amp; Tirado-Rives 1996, J. Am. Chem. Soc. 118, 11225. doi:10.1021/ja9621760</w:t>
+        <w:t xml:space="preserve">Jorgensen, Maxwell &amp; Tirado-Rives 1996, J. Am. Chem. Soc. 118, 11225. doi:10.1021/ja9621760 (the file added, ja9621760.pdf, is the paper's Supporting Information, which holds the parameter tables; the article itself is still to be added)</w:t>
       </w:r>
     </w:p>
     <w:p>
@@ -2007,6 +2208,26 @@
       </w:r>
       <w:r>
         <w:t xml:space="preserve"> ordered the stages by dependency (0–4 independent of C4/C5; 5–6 after the grid rebuild), tied each stage to where its output is used, checked compute against the 100 GB limit, and stated the one-frame limitation with an optional second frame.</w:t>
+      </w:r>
+    </w:p>
+    <w:p>
+      <w:pPr>
+        <w:pStyle w:val="ListParagraph"/>
+        <w:numPr>
+          <w:ilvl w:val="0"/>
+          <w:numId w:val="2"/>
+        </w:numPr>
+        <w:spacing w:after="60"/>
+      </w:pPr>
+      <w:r>
+        <w:rPr>
+          <w:b/>
+          <w:bCs/>
+        </w:rPr>
+        <w:t xml:space="preserve">Update after Stage 0 (7 October):</w:t>
+      </w:r>
+      <w:r>
+        <w:t xml:space="preserve"> OPLS-AA values read from the Supporting Information and checked against the page image; Behrens' σ/sp3 discrepancy recorded; Murphy 2000 read in the original rather than via Senn &amp; Thiel; Stage 2 sphere sizes fixed accordingly; the Jorgensen file identified as the Supporting Information (an identification check that had passed by coincidence of page count).</w:t>
       </w:r>
     </w:p>
     <w:sectPr>

</xml_diff>